<commit_message>
Shto komente të vogla te ndërfaqja (app.py) dhe rigjenero Shtojcën B
Co-Authored-By: Claude Sonnet 5.5 <noreply@anthropic.com>
Claude-Session: https://claude.ai/code/session_01BybxYwKhdCxZ7QT7Mx6uTb
</commit_message>
<xml_diff>
--- a/docs/Shtojca_B_nderfaqja_UETassist.docx
+++ b/docs/Shtojca_B_nderfaqja_UETassist.docx
@@ -188,6 +188,20 @@
           <w:sz w:val="16"/>
           <w:szCs w:val="16"/>
         </w:rPr>
+        <w:t xml:space="preserve"># Importet standarde të Python: html (mbrojtje nga HTML i padëshiruar), shutil, sys dhe Path</w:t>
+      </w:r>
+    </w:p>
+    <w:p>
+      <w:pPr>
+        <w:pStyle w:val="Kod"/>
+      </w:pPr>
+      <w:r>
+        <w:rPr>
+          <w:rFonts w:ascii="Consolas" w:cs="Consolas" w:eastAsia="Consolas" w:hAnsi="Consolas"/>
+          <w:noProof/>
+          <w:sz w:val="16"/>
+          <w:szCs w:val="16"/>
+        </w:rPr>
         <w:t xml:space="preserve">import html</w:t>
       </w:r>
     </w:p>
@@ -258,6 +272,20 @@
           <w:sz w:val="16"/>
           <w:szCs w:val="16"/>
         </w:rPr>
+        <w:t xml:space="preserve"># Shton dosjen src/ te rruga e moduleve, që importet si 'import rag' të funksionojnë kudo</w:t>
+      </w:r>
+    </w:p>
+    <w:p>
+      <w:pPr>
+        <w:pStyle w:val="Kod"/>
+      </w:pPr>
+      <w:r>
+        <w:rPr>
+          <w:rFonts w:ascii="Consolas" w:cs="Consolas" w:eastAsia="Consolas" w:hAnsi="Consolas"/>
+          <w:noProof/>
+          <w:sz w:val="16"/>
+          <w:szCs w:val="16"/>
+        </w:rPr>
         <w:t xml:space="preserve">sys.path.insert(0, str(Path(__file__).resolve().parent))</w:t>
       </w:r>
     </w:p>
@@ -398,6 +426,20 @@
           <w:sz w:val="16"/>
           <w:szCs w:val="16"/>
         </w:rPr>
+        <w:t xml:space="preserve"># Streamlit: biblioteka e ndërfaqes web</w:t>
+      </w:r>
+    </w:p>
+    <w:p>
+      <w:pPr>
+        <w:pStyle w:val="Kod"/>
+      </w:pPr>
+      <w:r>
+        <w:rPr>
+          <w:rFonts w:ascii="Consolas" w:cs="Consolas" w:eastAsia="Consolas" w:hAnsi="Consolas"/>
+          <w:noProof/>
+          <w:sz w:val="16"/>
+          <w:szCs w:val="16"/>
+        </w:rPr>
         <w:t xml:space="preserve">import streamlit as st  # noqa: E402</w:t>
       </w:r>
     </w:p>
@@ -426,6 +468,20 @@
           <w:sz w:val="16"/>
           <w:szCs w:val="16"/>
         </w:rPr>
+        <w:t xml:space="preserve"># Modulet e projektit: llogaritë, plani mësimor, LLM, profili, këshilltari, indeksi dhe RAG</w:t>
+      </w:r>
+    </w:p>
+    <w:p>
+      <w:pPr>
+        <w:pStyle w:val="Kod"/>
+      </w:pPr>
+      <w:r>
+        <w:rPr>
+          <w:rFonts w:ascii="Consolas" w:cs="Consolas" w:eastAsia="Consolas" w:hAnsi="Consolas"/>
+          <w:noProof/>
+          <w:sz w:val="16"/>
+          <w:szCs w:val="16"/>
+        </w:rPr>
         <w:t xml:space="preserve">import accounts  # noqa: E402</w:t>
       </w:r>
     </w:p>
@@ -552,6 +608,20 @@
           <w:sz w:val="16"/>
           <w:szCs w:val="16"/>
         </w:rPr>
+        <w:t xml:space="preserve"># Zgjedhjet për 'Programi i dëshiruar' te profili i studentit potencial</w:t>
+      </w:r>
+    </w:p>
+    <w:p>
+      <w:pPr>
+        <w:pStyle w:val="Kod"/>
+      </w:pPr>
+      <w:r>
+        <w:rPr>
+          <w:rFonts w:ascii="Consolas" w:cs="Consolas" w:eastAsia="Consolas" w:hAnsi="Consolas"/>
+          <w:noProof/>
+          <w:sz w:val="16"/>
+          <w:szCs w:val="16"/>
+        </w:rPr>
         <w:t xml:space="preserve">PROGRAM_OPTIONS = ["Master Profesional", "Master Shkencor"]</w:t>
       </w:r>
     </w:p>
@@ -566,6 +636,20 @@
           <w:sz w:val="16"/>
           <w:szCs w:val="16"/>
         </w:rPr>
+        <w:t xml:space="preserve"># Pyetja e gatshme që dërgohet kur shtypet 'Gjenero rrugën akademike'</w:t>
+      </w:r>
+    </w:p>
+    <w:p>
+      <w:pPr>
+        <w:pStyle w:val="Kod"/>
+      </w:pPr>
+      <w:r>
+        <w:rPr>
+          <w:rFonts w:ascii="Consolas" w:cs="Consolas" w:eastAsia="Consolas" w:hAnsi="Consolas"/>
+          <w:noProof/>
+          <w:sz w:val="16"/>
+          <w:szCs w:val="16"/>
+        </w:rPr>
         <w:t xml:space="preserve">PATH_QUESTION = "Më sugjero rrugën akademike më të përshtatshme sipas profilit tim."</w:t>
       </w:r>
     </w:p>
@@ -594,6 +678,20 @@
           <w:sz w:val="16"/>
           <w:szCs w:val="16"/>
         </w:rPr>
+        <w:t xml:space="preserve"># Rruga e logos së UET (assets/uet_logo.png)</w:t>
+      </w:r>
+    </w:p>
+    <w:p>
+      <w:pPr>
+        <w:pStyle w:val="Kod"/>
+      </w:pPr>
+      <w:r>
+        <w:rPr>
+          <w:rFonts w:ascii="Consolas" w:cs="Consolas" w:eastAsia="Consolas" w:hAnsi="Consolas"/>
+          <w:noProof/>
+          <w:sz w:val="16"/>
+          <w:szCs w:val="16"/>
+        </w:rPr>
         <w:t xml:space="preserve">LOGO_PATH = Path(__file__).resolve().parent.parent / "assets" / "uet_logo.png"</w:t>
       </w:r>
     </w:p>
@@ -622,6 +720,20 @@
           <w:sz w:val="16"/>
           <w:szCs w:val="16"/>
         </w:rPr>
+        <w:t xml:space="preserve"># Cilësimet e faqes: titulli i skedës, ikona dhe gjerësia</w:t>
+      </w:r>
+    </w:p>
+    <w:p>
+      <w:pPr>
+        <w:pStyle w:val="Kod"/>
+      </w:pPr>
+      <w:r>
+        <w:rPr>
+          <w:rFonts w:ascii="Consolas" w:cs="Consolas" w:eastAsia="Consolas" w:hAnsi="Consolas"/>
+          <w:noProof/>
+          <w:sz w:val="16"/>
+          <w:szCs w:val="16"/>
+        </w:rPr>
         <w:t xml:space="preserve">st.set_page_config(page_title="UETassist", page_icon=str(LOGO_PATH), layout="centered")</w:t>
       </w:r>
     </w:p>
@@ -650,6 +762,20 @@
           <w:sz w:val="16"/>
           <w:szCs w:val="16"/>
         </w:rPr>
+        <w:t xml:space="preserve"># Ngarkon stilet nga style.css dhe i injekton te faqja</w:t>
+      </w:r>
+    </w:p>
+    <w:p>
+      <w:pPr>
+        <w:pStyle w:val="Kod"/>
+      </w:pPr>
+      <w:r>
+        <w:rPr>
+          <w:rFonts w:ascii="Consolas" w:cs="Consolas" w:eastAsia="Consolas" w:hAnsi="Consolas"/>
+          <w:noProof/>
+          <w:sz w:val="16"/>
+          <w:szCs w:val="16"/>
+        </w:rPr>
         <w:t xml:space="preserve">st.markdown(</w:t>
       </w:r>
     </w:p>
@@ -734,6 +860,20 @@
           <w:sz w:val="16"/>
           <w:szCs w:val="16"/>
         </w:rPr>
+        <w:t xml:space="preserve"># Krijon tabelën e përdoruesve te SQLite nëse nuk ekziston</w:t>
+      </w:r>
+    </w:p>
+    <w:p>
+      <w:pPr>
+        <w:pStyle w:val="Kod"/>
+      </w:pPr>
+      <w:r>
+        <w:rPr>
+          <w:rFonts w:ascii="Consolas" w:cs="Consolas" w:eastAsia="Consolas" w:hAnsi="Consolas"/>
+          <w:noProof/>
+          <w:sz w:val="16"/>
+          <w:szCs w:val="16"/>
+        </w:rPr>
         <w:t xml:space="preserve">accounts.init_db()</w:t>
       </w:r>
     </w:p>
@@ -776,6 +916,20 @@
           <w:sz w:val="16"/>
           <w:szCs w:val="16"/>
         </w:rPr>
+        <w:t xml:space="preserve"># Ndihmës për selectbox: gjen pozicionin e vlerës ekzistuese te lista</w:t>
+      </w:r>
+    </w:p>
+    <w:p>
+      <w:pPr>
+        <w:pStyle w:val="Kod"/>
+      </w:pPr>
+      <w:r>
+        <w:rPr>
+          <w:rFonts w:ascii="Consolas" w:cs="Consolas" w:eastAsia="Consolas" w:hAnsi="Consolas"/>
+          <w:noProof/>
+          <w:sz w:val="16"/>
+          <w:szCs w:val="16"/>
+        </w:rPr>
         <w:t xml:space="preserve">def pick(options: list, value):</w:t>
       </w:r>
     </w:p>
@@ -846,6 +1000,20 @@
           <w:sz w:val="16"/>
           <w:szCs w:val="16"/>
         </w:rPr>
+        <w:t xml:space="preserve"># Faqja e hyrjes dhe regjistrimit (shfaqet para çdo gjëje tjetër)</w:t>
+      </w:r>
+    </w:p>
+    <w:p>
+      <w:pPr>
+        <w:pStyle w:val="Kod"/>
+      </w:pPr>
+      <w:r>
+        <w:rPr>
+          <w:rFonts w:ascii="Consolas" w:cs="Consolas" w:eastAsia="Consolas" w:hAnsi="Consolas"/>
+          <w:noProof/>
+          <w:sz w:val="16"/>
+          <w:szCs w:val="16"/>
+        </w:rPr>
         <w:t xml:space="preserve">def login_screen() -&gt; None:</w:t>
       </w:r>
     </w:p>
@@ -958,6 +1126,20 @@
           <w:sz w:val="16"/>
           <w:szCs w:val="16"/>
         </w:rPr>
+        <w:t xml:space="preserve">    # Dy skeda: hyrje me llogari ekzistuese dhe regjistrim i ri</w:t>
+      </w:r>
+    </w:p>
+    <w:p>
+      <w:pPr>
+        <w:pStyle w:val="Kod"/>
+      </w:pPr>
+      <w:r>
+        <w:rPr>
+          <w:rFonts w:ascii="Consolas" w:cs="Consolas" w:eastAsia="Consolas" w:hAnsi="Consolas"/>
+          <w:noProof/>
+          <w:sz w:val="16"/>
+          <w:szCs w:val="16"/>
+        </w:rPr>
         <w:t xml:space="preserve">    login_tab, register_tab = st.tabs(["Hyr", "Regjistrohu"])</w:t>
       </w:r>
     </w:p>
@@ -1028,6 +1210,20 @@
           <w:sz w:val="16"/>
           <w:szCs w:val="16"/>
         </w:rPr>
+        <w:t xml:space="preserve">            # Verifikon fjalëkalimin kundrejt hash-it të ruajtur; kthen None nëse është gabim</w:t>
+      </w:r>
+    </w:p>
+    <w:p>
+      <w:pPr>
+        <w:pStyle w:val="Kod"/>
+      </w:pPr>
+      <w:r>
+        <w:rPr>
+          <w:rFonts w:ascii="Consolas" w:cs="Consolas" w:eastAsia="Consolas" w:hAnsi="Consolas"/>
+          <w:noProof/>
+          <w:sz w:val="16"/>
+          <w:szCs w:val="16"/>
+        </w:rPr>
         <w:t xml:space="preserve">            user = accounts.authenticate(username, password)</w:t>
       </w:r>
     </w:p>
@@ -1182,6 +1378,20 @@
           <w:sz w:val="16"/>
           <w:szCs w:val="16"/>
         </w:rPr>
+        <w:t xml:space="preserve">                # Kthen çelësin e rolit ('current' ose 'prospective') nga etiketa e zgjedhur</w:t>
+      </w:r>
+    </w:p>
+    <w:p>
+      <w:pPr>
+        <w:pStyle w:val="Kod"/>
+      </w:pPr>
+      <w:r>
+        <w:rPr>
+          <w:rFonts w:ascii="Consolas" w:cs="Consolas" w:eastAsia="Consolas" w:hAnsi="Consolas"/>
+          <w:noProof/>
+          <w:sz w:val="16"/>
+          <w:szCs w:val="16"/>
+        </w:rPr>
         <w:t xml:space="preserve">                role = next((key for key, label in accounts.ROLES.items() if label == role_label), "")</w:t>
       </w:r>
     </w:p>
@@ -1196,6 +1406,20 @@
           <w:sz w:val="16"/>
           <w:szCs w:val="16"/>
         </w:rPr>
+        <w:t xml:space="preserve">                # Krijon llogarinë dhe e hap menjëherë sesionin</w:t>
+      </w:r>
+    </w:p>
+    <w:p>
+      <w:pPr>
+        <w:pStyle w:val="Kod"/>
+      </w:pPr>
+      <w:r>
+        <w:rPr>
+          <w:rFonts w:ascii="Consolas" w:cs="Consolas" w:eastAsia="Consolas" w:hAnsi="Consolas"/>
+          <w:noProof/>
+          <w:sz w:val="16"/>
+          <w:szCs w:val="16"/>
+        </w:rPr>
         <w:t xml:space="preserve">                start_session(accounts.create_user(new_username, new_password, role))</w:t>
       </w:r>
     </w:p>
@@ -1280,6 +1504,20 @@
           <w:sz w:val="16"/>
           <w:szCs w:val="16"/>
         </w:rPr>
+        <w:t xml:space="preserve"># Ngarkon të dhënat e përdoruesit te gjendja e sesionit (st.session_state)</w:t>
+      </w:r>
+    </w:p>
+    <w:p>
+      <w:pPr>
+        <w:pStyle w:val="Kod"/>
+      </w:pPr>
+      <w:r>
+        <w:rPr>
+          <w:rFonts w:ascii="Consolas" w:cs="Consolas" w:eastAsia="Consolas" w:hAnsi="Consolas"/>
+          <w:noProof/>
+          <w:sz w:val="16"/>
+          <w:szCs w:val="16"/>
+        </w:rPr>
         <w:t xml:space="preserve">def start_session(user: dict) -&gt; None:</w:t>
       </w:r>
     </w:p>
@@ -1378,6 +1616,20 @@
           <w:sz w:val="16"/>
           <w:szCs w:val="16"/>
         </w:rPr>
+        <w:t xml:space="preserve"># Ruan profilin, të dhënat akademike dhe rolin te baza SQLite</w:t>
+      </w:r>
+    </w:p>
+    <w:p>
+      <w:pPr>
+        <w:pStyle w:val="Kod"/>
+      </w:pPr>
+      <w:r>
+        <w:rPr>
+          <w:rFonts w:ascii="Consolas" w:cs="Consolas" w:eastAsia="Consolas" w:hAnsi="Consolas"/>
+          <w:noProof/>
+          <w:sz w:val="16"/>
+          <w:szCs w:val="16"/>
+        </w:rPr>
         <w:t xml:space="preserve">def save_user() -&gt; None:</w:t>
       </w:r>
     </w:p>
@@ -1462,6 +1714,20 @@
           <w:sz w:val="16"/>
           <w:szCs w:val="16"/>
         </w:rPr>
+        <w:t xml:space="preserve"># Plani mësimor ngarkohet një herë dhe mbahet në kujtesë (cache)</w:t>
+      </w:r>
+    </w:p>
+    <w:p>
+      <w:pPr>
+        <w:pStyle w:val="Kod"/>
+      </w:pPr>
+      <w:r>
+        <w:rPr>
+          <w:rFonts w:ascii="Consolas" w:cs="Consolas" w:eastAsia="Consolas" w:hAnsi="Consolas"/>
+          <w:noProof/>
+          <w:sz w:val="16"/>
+          <w:szCs w:val="16"/>
+        </w:rPr>
         <w:t xml:space="preserve">@st.cache_data</w:t>
       </w:r>
     </w:p>
@@ -1700,6 +1966,20 @@
           <w:sz w:val="16"/>
           <w:szCs w:val="16"/>
         </w:rPr>
+        <w:t xml:space="preserve"># Asistenti RAG ngarkohet një herë për gjithë serverin, jo për çdo ndërveprim</w:t>
+      </w:r>
+    </w:p>
+    <w:p>
+      <w:pPr>
+        <w:pStyle w:val="Kod"/>
+      </w:pPr>
+      <w:r>
+        <w:rPr>
+          <w:rFonts w:ascii="Consolas" w:cs="Consolas" w:eastAsia="Consolas" w:hAnsi="Consolas"/>
+          <w:noProof/>
+          <w:sz w:val="16"/>
+          <w:szCs w:val="16"/>
+        </w:rPr>
         <w:t xml:space="preserve">@st.cache_resource(show_spinner="Duke ngarkuar bazën e njohurive...")</w:t>
       </w:r>
     </w:p>
@@ -1882,6 +2162,20 @@
           <w:sz w:val="16"/>
           <w:szCs w:val="16"/>
         </w:rPr>
+        <w:t xml:space="preserve"># Ndërton asistentin RAG dhe këshilltarin; trajton gabimet e çelësit API dhe të bazës</w:t>
+      </w:r>
+    </w:p>
+    <w:p>
+      <w:pPr>
+        <w:pStyle w:val="Kod"/>
+      </w:pPr>
+      <w:r>
+        <w:rPr>
+          <w:rFonts w:ascii="Consolas" w:cs="Consolas" w:eastAsia="Consolas" w:hAnsi="Consolas"/>
+          <w:noProof/>
+          <w:sz w:val="16"/>
+          <w:szCs w:val="16"/>
+        </w:rPr>
         <w:t xml:space="preserve">try:</w:t>
       </w:r>
     </w:p>
@@ -2246,6 +2540,20 @@
           <w:sz w:val="16"/>
           <w:szCs w:val="16"/>
         </w:rPr>
+        <w:t xml:space="preserve">    # Ndërrimi i rolit (student aktual ose potencial) ruhet te llogaria</w:t>
+      </w:r>
+    </w:p>
+    <w:p>
+      <w:pPr>
+        <w:pStyle w:val="Kod"/>
+      </w:pPr>
+      <w:r>
+        <w:rPr>
+          <w:rFonts w:ascii="Consolas" w:cs="Consolas" w:eastAsia="Consolas" w:hAnsi="Consolas"/>
+          <w:noProof/>
+          <w:sz w:val="16"/>
+          <w:szCs w:val="16"/>
+        </w:rPr>
         <w:t xml:space="preserve">    chosen = st.selectbox("Roli", role_labels, index=role_labels.index(accounts.ROLES[role]))</w:t>
       </w:r>
     </w:p>
@@ -2330,6 +2638,20 @@
           <w:sz w:val="16"/>
           <w:szCs w:val="16"/>
         </w:rPr>
+        <w:t xml:space="preserve">    # Profili akademik: vetëm për studentin aktual</w:t>
+      </w:r>
+    </w:p>
+    <w:p>
+      <w:pPr>
+        <w:pStyle w:val="Kod"/>
+      </w:pPr>
+      <w:r>
+        <w:rPr>
+          <w:rFonts w:ascii="Consolas" w:cs="Consolas" w:eastAsia="Consolas" w:hAnsi="Consolas"/>
+          <w:noProof/>
+          <w:sz w:val="16"/>
+          <w:szCs w:val="16"/>
+        </w:rPr>
         <w:t xml:space="preserve">    if role == "current":</w:t>
       </w:r>
     </w:p>
@@ -2442,6 +2764,20 @@
           <w:sz w:val="16"/>
           <w:szCs w:val="16"/>
         </w:rPr>
+        <w:t xml:space="preserve">            # Fakulteti dhe departamenti: tekst i lirë, sepse nuk gjenden te dokumentet</w:t>
+      </w:r>
+    </w:p>
+    <w:p>
+      <w:pPr>
+        <w:pStyle w:val="Kod"/>
+      </w:pPr>
+      <w:r>
+        <w:rPr>
+          <w:rFonts w:ascii="Consolas" w:cs="Consolas" w:eastAsia="Consolas" w:hAnsi="Consolas"/>
+          <w:noProof/>
+          <w:sz w:val="16"/>
+          <w:szCs w:val="16"/>
+        </w:rPr>
         <w:t xml:space="preserve">            faculty = st.text_input("Fakulteti", academic["faculty"], key="acad_faculty")</w:t>
       </w:r>
     </w:p>
@@ -2498,6 +2834,20 @@
           <w:sz w:val="16"/>
           <w:szCs w:val="16"/>
         </w:rPr>
+        <w:t xml:space="preserve">            # Specializimet merren nga plani mësimor i programit të zgjedhur</w:t>
+      </w:r>
+    </w:p>
+    <w:p>
+      <w:pPr>
+        <w:pStyle w:val="Kod"/>
+      </w:pPr>
+      <w:r>
+        <w:rPr>
+          <w:rFonts w:ascii="Consolas" w:cs="Consolas" w:eastAsia="Consolas" w:hAnsi="Consolas"/>
+          <w:noProof/>
+          <w:sz w:val="16"/>
+          <w:szCs w:val="16"/>
+        </w:rPr>
         <w:t xml:space="preserve">            profiles = curriculum.profiles_for(curriculum_data, program) if program else []</w:t>
       </w:r>
     </w:p>
@@ -2512,6 +2862,20 @@
           <w:sz w:val="16"/>
           <w:szCs w:val="16"/>
         </w:rPr>
+        <w:t xml:space="preserve">            # Me specializime nga plani: listë zgjedhjeje; përndryshe: tekst i lirë</w:t>
+      </w:r>
+    </w:p>
+    <w:p>
+      <w:pPr>
+        <w:pStyle w:val="Kod"/>
+      </w:pPr>
+      <w:r>
+        <w:rPr>
+          <w:rFonts w:ascii="Consolas" w:cs="Consolas" w:eastAsia="Consolas" w:hAnsi="Consolas"/>
+          <w:noProof/>
+          <w:sz w:val="16"/>
+          <w:szCs w:val="16"/>
+        </w:rPr>
         <w:t xml:space="preserve">            if profiles:</w:t>
       </w:r>
     </w:p>
@@ -2638,6 +3002,20 @@
           <w:sz w:val="16"/>
           <w:szCs w:val="16"/>
         </w:rPr>
+        <w:t xml:space="preserve">            # Ruan zgjedhjet dhe del nga Study Mode, sepse lëndët e semestrit mund të kenë ndryshuar</w:t>
+      </w:r>
+    </w:p>
+    <w:p>
+      <w:pPr>
+        <w:pStyle w:val="Kod"/>
+      </w:pPr>
+      <w:r>
+        <w:rPr>
+          <w:rFonts w:ascii="Consolas" w:cs="Consolas" w:eastAsia="Consolas" w:hAnsi="Consolas"/>
+          <w:noProof/>
+          <w:sz w:val="16"/>
+          <w:szCs w:val="16"/>
+        </w:rPr>
         <w:t xml:space="preserve">            if st.button("Ruaj profilin akademik", width="stretch", key="acad_save"):</w:t>
       </w:r>
     </w:p>
@@ -2778,6 +3156,20 @@
           <w:sz w:val="16"/>
           <w:szCs w:val="16"/>
         </w:rPr>
+        <w:t xml:space="preserve">    # Profili i interesave dhe aftësive: plotësohet nga biseda ose manualisht</w:t>
+      </w:r>
+    </w:p>
+    <w:p>
+      <w:pPr>
+        <w:pStyle w:val="Kod"/>
+      </w:pPr>
+      <w:r>
+        <w:rPr>
+          <w:rFonts w:ascii="Consolas" w:cs="Consolas" w:eastAsia="Consolas" w:hAnsi="Consolas"/>
+          <w:noProof/>
+          <w:sz w:val="16"/>
+          <w:szCs w:val="16"/>
+        </w:rPr>
         <w:t xml:space="preserve">    with st.expander("Profili im" if role == "prospective" else "Interesat dhe aftësitë", expanded=role == "prospective" and not is_empty(profile)):</w:t>
       </w:r>
     </w:p>
@@ -2890,6 +3282,20 @@
           <w:sz w:val="16"/>
           <w:szCs w:val="16"/>
         </w:rPr>
+        <w:t xml:space="preserve">        # Formular manual: ndryshimet ruhen vetëm kur shtypet 'Ruaj profilin'</w:t>
+      </w:r>
+    </w:p>
+    <w:p>
+      <w:pPr>
+        <w:pStyle w:val="Kod"/>
+      </w:pPr>
+      <w:r>
+        <w:rPr>
+          <w:rFonts w:ascii="Consolas" w:cs="Consolas" w:eastAsia="Consolas" w:hAnsi="Consolas"/>
+          <w:noProof/>
+          <w:sz w:val="16"/>
+          <w:szCs w:val="16"/>
+        </w:rPr>
         <w:t xml:space="preserve">        with st.form("profile_form"):</w:t>
       </w:r>
     </w:p>
@@ -3184,6 +3590,20 @@
           <w:sz w:val="16"/>
           <w:szCs w:val="16"/>
         </w:rPr>
+        <w:t xml:space="preserve">        # Rruga akademike e gatshme: vetëm për studentin potencial</w:t>
+      </w:r>
+    </w:p>
+    <w:p>
+      <w:pPr>
+        <w:pStyle w:val="Kod"/>
+      </w:pPr>
+      <w:r>
+        <w:rPr>
+          <w:rFonts w:ascii="Consolas" w:cs="Consolas" w:eastAsia="Consolas" w:hAnsi="Consolas"/>
+          <w:noProof/>
+          <w:sz w:val="16"/>
+          <w:szCs w:val="16"/>
+        </w:rPr>
         <w:t xml:space="preserve">        if role == "prospective" and st.button("Gjenero rrugën akademike", width="stretch", key="gen_path"):</w:t>
       </w:r>
     </w:p>
@@ -3212,6 +3632,20 @@
           <w:sz w:val="16"/>
           <w:szCs w:val="16"/>
         </w:rPr>
+        <w:t xml:space="preserve">        # Fshin profilin (dhe të dhënat akademike të studentit aktual)</w:t>
+      </w:r>
+    </w:p>
+    <w:p>
+      <w:pPr>
+        <w:pStyle w:val="Kod"/>
+      </w:pPr>
+      <w:r>
+        <w:rPr>
+          <w:rFonts w:ascii="Consolas" w:cs="Consolas" w:eastAsia="Consolas" w:hAnsi="Consolas"/>
+          <w:noProof/>
+          <w:sz w:val="16"/>
+          <w:szCs w:val="16"/>
+        </w:rPr>
         <w:t xml:space="preserve">        if st.button("Rivendos profilin", width="stretch", key="reset_profile"):</w:t>
       </w:r>
     </w:p>
@@ -3324,6 +3758,20 @@
           <w:sz w:val="16"/>
           <w:szCs w:val="16"/>
         </w:rPr>
+        <w:t xml:space="preserve">    # Fshin vetëm bisedën; profili mbetet</w:t>
+      </w:r>
+    </w:p>
+    <w:p>
+      <w:pPr>
+        <w:pStyle w:val="Kod"/>
+      </w:pPr>
+      <w:r>
+        <w:rPr>
+          <w:rFonts w:ascii="Consolas" w:cs="Consolas" w:eastAsia="Consolas" w:hAnsi="Consolas"/>
+          <w:noProof/>
+          <w:sz w:val="16"/>
+          <w:szCs w:val="16"/>
+        </w:rPr>
         <w:t xml:space="preserve">    if st.button("Pastro bisedën", width="stretch", key="clear_sidebar"):</w:t>
       </w:r>
     </w:p>
@@ -3380,6 +3828,20 @@
           <w:sz w:val="16"/>
           <w:szCs w:val="16"/>
         </w:rPr>
+        <w:t xml:space="preserve">    # Dalja: pastron sesionin dhe kthen faqen e hyrjes</w:t>
+      </w:r>
+    </w:p>
+    <w:p>
+      <w:pPr>
+        <w:pStyle w:val="Kod"/>
+      </w:pPr>
+      <w:r>
+        <w:rPr>
+          <w:rFonts w:ascii="Consolas" w:cs="Consolas" w:eastAsia="Consolas" w:hAnsi="Consolas"/>
+          <w:noProof/>
+          <w:sz w:val="16"/>
+          <w:szCs w:val="16"/>
+        </w:rPr>
         <w:t xml:space="preserve">    if st.button("Dil", width="stretch", key="logout"):</w:t>
       </w:r>
     </w:p>
@@ -3576,6 +4038,20 @@
           <w:sz w:val="16"/>
           <w:szCs w:val="16"/>
         </w:rPr>
+        <w:t xml:space="preserve"># Historia e bisedës ruhet vetëm në sesion (nuk shkruhet në disk)</w:t>
+      </w:r>
+    </w:p>
+    <w:p>
+      <w:pPr>
+        <w:pStyle w:val="Kod"/>
+      </w:pPr>
+      <w:r>
+        <w:rPr>
+          <w:rFonts w:ascii="Consolas" w:cs="Consolas" w:eastAsia="Consolas" w:hAnsi="Consolas"/>
+          <w:noProof/>
+          <w:sz w:val="16"/>
+          <w:szCs w:val="16"/>
+        </w:rPr>
         <w:t xml:space="preserve">if "messages" not in st.session_state:</w:t>
       </w:r>
     </w:p>
@@ -3772,6 +4248,20 @@
           <w:sz w:val="16"/>
           <w:szCs w:val="16"/>
         </w:rPr>
+        <w:t xml:space="preserve"># Del nga Study Mode (thirret nga butoni 'Dil nga Study Mode')</w:t>
+      </w:r>
+    </w:p>
+    <w:p>
+      <w:pPr>
+        <w:pStyle w:val="Kod"/>
+      </w:pPr>
+      <w:r>
+        <w:rPr>
+          <w:rFonts w:ascii="Consolas" w:cs="Consolas" w:eastAsia="Consolas" w:hAnsi="Consolas"/>
+          <w:noProof/>
+          <w:sz w:val="16"/>
+          <w:szCs w:val="16"/>
+        </w:rPr>
         <w:t xml:space="preserve">def leave_study_mode() -&gt; None:</w:t>
       </w:r>
     </w:p>
@@ -3870,6 +4360,20 @@
           <w:sz w:val="16"/>
           <w:szCs w:val="16"/>
         </w:rPr>
+        <w:t xml:space="preserve">    # Pa program të zgjedhur nuk mund të përcaktohen lëndët</w:t>
+      </w:r>
+    </w:p>
+    <w:p>
+      <w:pPr>
+        <w:pStyle w:val="Kod"/>
+      </w:pPr>
+      <w:r>
+        <w:rPr>
+          <w:rFonts w:ascii="Consolas" w:cs="Consolas" w:eastAsia="Consolas" w:hAnsi="Consolas"/>
+          <w:noProof/>
+          <w:sz w:val="16"/>
+          <w:szCs w:val="16"/>
+        </w:rPr>
         <w:t xml:space="preserve">    if not academic.get("program"):</w:t>
       </w:r>
     </w:p>
@@ -3912,6 +4416,20 @@
           <w:sz w:val="16"/>
           <w:szCs w:val="16"/>
         </w:rPr>
+        <w:t xml:space="preserve">    # Rreshtat e kartës së kontekstit: programi, specializimi, viti dhe semestri</w:t>
+      </w:r>
+    </w:p>
+    <w:p>
+      <w:pPr>
+        <w:pStyle w:val="Kod"/>
+      </w:pPr>
+      <w:r>
+        <w:rPr>
+          <w:rFonts w:ascii="Consolas" w:cs="Consolas" w:eastAsia="Consolas" w:hAnsi="Consolas"/>
+          <w:noProof/>
+          <w:sz w:val="16"/>
+          <w:szCs w:val="16"/>
+        </w:rPr>
         <w:t xml:space="preserve">    lines = [academic["program"]]</w:t>
       </w:r>
     </w:p>
@@ -3982,6 +4500,20 @@
           <w:sz w:val="16"/>
           <w:szCs w:val="16"/>
         </w:rPr>
+        <w:t xml:space="preserve">    # Karta e kontekstit; html.escape mbron nga futja e HTML-së nga përdoruesi</w:t>
+      </w:r>
+    </w:p>
+    <w:p>
+      <w:pPr>
+        <w:pStyle w:val="Kod"/>
+      </w:pPr>
+      <w:r>
+        <w:rPr>
+          <w:rFonts w:ascii="Consolas" w:cs="Consolas" w:eastAsia="Consolas" w:hAnsi="Consolas"/>
+          <w:noProof/>
+          <w:sz w:val="16"/>
+          <w:szCs w:val="16"/>
+        </w:rPr>
         <w:t xml:space="preserve">    st.markdown(</w:t>
       </w:r>
     </w:p>
@@ -4108,6 +4640,20 @@
           <w:sz w:val="16"/>
           <w:szCs w:val="16"/>
         </w:rPr>
+        <w:t xml:space="preserve">    # Lëndët e semestrit sipas programit, specializimit, vitit dhe semestrit</w:t>
+      </w:r>
+    </w:p>
+    <w:p>
+      <w:pPr>
+        <w:pStyle w:val="Kod"/>
+      </w:pPr>
+      <w:r>
+        <w:rPr>
+          <w:rFonts w:ascii="Consolas" w:cs="Consolas" w:eastAsia="Consolas" w:hAnsi="Consolas"/>
+          <w:noProof/>
+          <w:sz w:val="16"/>
+          <w:szCs w:val="16"/>
+        </w:rPr>
         <w:t xml:space="preserve">    courses = curriculum.courses_for(curriculum_data, academic["program"], int(academic["year"]), int(academic["semester"]), academic.get("specialization", ""))</w:t>
       </w:r>
     </w:p>
@@ -4192,6 +4738,20 @@
           <w:sz w:val="16"/>
           <w:szCs w:val="16"/>
         </w:rPr>
+        <w:t xml:space="preserve">    # Lista e lëndëve me ECTS</w:t>
+      </w:r>
+    </w:p>
+    <w:p>
+      <w:pPr>
+        <w:pStyle w:val="Kod"/>
+      </w:pPr>
+      <w:r>
+        <w:rPr>
+          <w:rFonts w:ascii="Consolas" w:cs="Consolas" w:eastAsia="Consolas" w:hAnsi="Consolas"/>
+          <w:noProof/>
+          <w:sz w:val="16"/>
+          <w:szCs w:val="16"/>
+        </w:rPr>
         <w:t xml:space="preserve">    with st.expander(f"Lëndët e semestrit ({len(names)})", expanded=not st.session_state.get("study_course")):</w:t>
       </w:r>
     </w:p>
@@ -4262,6 +4822,20 @@
           <w:sz w:val="16"/>
           <w:szCs w:val="16"/>
         </w:rPr>
+        <w:t xml:space="preserve">    # Zgjedhja e lëndës për Study Mode</w:t>
+      </w:r>
+    </w:p>
+    <w:p>
+      <w:pPr>
+        <w:pStyle w:val="Kod"/>
+      </w:pPr>
+      <w:r>
+        <w:rPr>
+          <w:rFonts w:ascii="Consolas" w:cs="Consolas" w:eastAsia="Consolas" w:hAnsi="Consolas"/>
+          <w:noProof/>
+          <w:sz w:val="16"/>
+          <w:szCs w:val="16"/>
+        </w:rPr>
         <w:t xml:space="preserve">    st.selectbox("Study Mode: zgjidh një lëndë", names, index=pick(names, st.session_state.get("study_course")), placeholder="Zgjidh lëndën", key="study_select")</w:t>
       </w:r>
     </w:p>
@@ -4304,6 +4878,20 @@
           <w:sz w:val="16"/>
           <w:szCs w:val="16"/>
         </w:rPr>
+        <w:t xml:space="preserve">    # Kur është zgjedhur një lëndë: banner, butonat e veprimeve dhe materiali i ngjitur</w:t>
+      </w:r>
+    </w:p>
+    <w:p>
+      <w:pPr>
+        <w:pStyle w:val="Kod"/>
+      </w:pPr>
+      <w:r>
+        <w:rPr>
+          <w:rFonts w:ascii="Consolas" w:cs="Consolas" w:eastAsia="Consolas" w:hAnsi="Consolas"/>
+          <w:noProof/>
+          <w:sz w:val="16"/>
+          <w:szCs w:val="16"/>
+        </w:rPr>
         <w:t xml:space="preserve">    course = st.session_state["study_course"]</w:t>
       </w:r>
     </w:p>
@@ -4360,6 +4948,20 @@
           <w:sz w:val="16"/>
           <w:szCs w:val="16"/>
         </w:rPr>
+        <w:t xml:space="preserve">        # Një buton për secilin veprim; shtypja vendos pyetjen dhe detyrën në pritje</w:t>
+      </w:r>
+    </w:p>
+    <w:p>
+      <w:pPr>
+        <w:pStyle w:val="Kod"/>
+      </w:pPr>
+      <w:r>
+        <w:rPr>
+          <w:rFonts w:ascii="Consolas" w:cs="Consolas" w:eastAsia="Consolas" w:hAnsi="Consolas"/>
+          <w:noProof/>
+          <w:sz w:val="16"/>
+          <w:szCs w:val="16"/>
+        </w:rPr>
         <w:t xml:space="preserve">        columns = st.columns(len(STUDY_ACTIONS))</w:t>
       </w:r>
     </w:p>
@@ -4430,6 +5032,20 @@
           <w:sz w:val="16"/>
           <w:szCs w:val="16"/>
         </w:rPr>
+        <w:t xml:space="preserve">        # Studenti mund të ngjitë materialin e vet, që përdoret si burim</w:t>
+      </w:r>
+    </w:p>
+    <w:p>
+      <w:pPr>
+        <w:pStyle w:val="Kod"/>
+      </w:pPr>
+      <w:r>
+        <w:rPr>
+          <w:rFonts w:ascii="Consolas" w:cs="Consolas" w:eastAsia="Consolas" w:hAnsi="Consolas"/>
+          <w:noProof/>
+          <w:sz w:val="16"/>
+          <w:szCs w:val="16"/>
+        </w:rPr>
         <w:t xml:space="preserve">        with st.expander("Materiali im (opsional)"):</w:t>
       </w:r>
     </w:p>
@@ -4556,6 +5172,20 @@
           <w:sz w:val="16"/>
           <w:szCs w:val="16"/>
         </w:rPr>
+        <w:t xml:space="preserve"># Paneli i studentit aktual, ose vetëm etiketa e modalitetit për studentin potencial</w:t>
+      </w:r>
+    </w:p>
+    <w:p>
+      <w:pPr>
+        <w:pStyle w:val="Kod"/>
+      </w:pPr>
+      <w:r>
+        <w:rPr>
+          <w:rFonts w:ascii="Consolas" w:cs="Consolas" w:eastAsia="Consolas" w:hAnsi="Consolas"/>
+          <w:noProof/>
+          <w:sz w:val="16"/>
+          <w:szCs w:val="16"/>
+        </w:rPr>
         <w:t xml:space="preserve">role_label = accounts.ROLES[role]</w:t>
       </w:r>
     </w:p>
@@ -4640,6 +5270,20 @@
           <w:sz w:val="16"/>
           <w:szCs w:val="16"/>
         </w:rPr>
+        <w:t xml:space="preserve"># Butoni i dytë 'Pastro bisedën', në krye të bisedës</w:t>
+      </w:r>
+    </w:p>
+    <w:p>
+      <w:pPr>
+        <w:pStyle w:val="Kod"/>
+      </w:pPr>
+      <w:r>
+        <w:rPr>
+          <w:rFonts w:ascii="Consolas" w:cs="Consolas" w:eastAsia="Consolas" w:hAnsi="Consolas"/>
+          <w:noProof/>
+          <w:sz w:val="16"/>
+          <w:szCs w:val="16"/>
+        </w:rPr>
         <w:t xml:space="preserve">if st.session_state["messages"] and st.button("Pastro bisedën", key="clear_main"):</w:t>
       </w:r>
     </w:p>
@@ -4724,6 +5368,20 @@
           <w:sz w:val="16"/>
           <w:szCs w:val="16"/>
         </w:rPr>
+        <w:t xml:space="preserve"># Njoftimi i vogël kur biseda përditëson profilin</w:t>
+      </w:r>
+    </w:p>
+    <w:p>
+      <w:pPr>
+        <w:pStyle w:val="Kod"/>
+      </w:pPr>
+      <w:r>
+        <w:rPr>
+          <w:rFonts w:ascii="Consolas" w:cs="Consolas" w:eastAsia="Consolas" w:hAnsi="Consolas"/>
+          <w:noProof/>
+          <w:sz w:val="16"/>
+          <w:szCs w:val="16"/>
+        </w:rPr>
         <w:t xml:space="preserve">def show_profile_changes(changes: list[str]) -&gt; None:</w:t>
       </w:r>
     </w:p>
@@ -4794,6 +5452,20 @@
           <w:sz w:val="16"/>
           <w:szCs w:val="16"/>
         </w:rPr>
+        <w:t xml:space="preserve"># Kutia 'Burimet e përdorura': titujt, faqet dhe pjesët e dokumenteve</w:t>
+      </w:r>
+    </w:p>
+    <w:p>
+      <w:pPr>
+        <w:pStyle w:val="Kod"/>
+      </w:pPr>
+      <w:r>
+        <w:rPr>
+          <w:rFonts w:ascii="Consolas" w:cs="Consolas" w:eastAsia="Consolas" w:hAnsi="Consolas"/>
+          <w:noProof/>
+          <w:sz w:val="16"/>
+          <w:szCs w:val="16"/>
+        </w:rPr>
         <w:t xml:space="preserve">def show_sources(sources: list[dict], chunks: list[dict]) -&gt; None:</w:t>
       </w:r>
     </w:p>
@@ -4990,6 +5662,20 @@
           <w:sz w:val="16"/>
           <w:szCs w:val="16"/>
         </w:rPr>
+        <w:t xml:space="preserve"># Rishfaq historinë e bisedës pas çdo rifreskimi të faqes</w:t>
+      </w:r>
+    </w:p>
+    <w:p>
+      <w:pPr>
+        <w:pStyle w:val="Kod"/>
+      </w:pPr>
+      <w:r>
+        <w:rPr>
+          <w:rFonts w:ascii="Consolas" w:cs="Consolas" w:eastAsia="Consolas" w:hAnsi="Consolas"/>
+          <w:noProof/>
+          <w:sz w:val="16"/>
+          <w:szCs w:val="16"/>
+        </w:rPr>
         <w:t xml:space="preserve">for message in st.session_state["messages"]:</w:t>
       </w:r>
     </w:p>
@@ -5088,6 +5774,20 @@
           <w:sz w:val="16"/>
           <w:szCs w:val="16"/>
         </w:rPr>
+        <w:t xml:space="preserve"># Pyetja vjen nga kutia e shkrimit ose nga butonat e gatshëm (pending_question)</w:t>
+      </w:r>
+    </w:p>
+    <w:p>
+      <w:pPr>
+        <w:pStyle w:val="Kod"/>
+      </w:pPr>
+      <w:r>
+        <w:rPr>
+          <w:rFonts w:ascii="Consolas" w:cs="Consolas" w:eastAsia="Consolas" w:hAnsi="Consolas"/>
+          <w:noProof/>
+          <w:sz w:val="16"/>
+          <w:szCs w:val="16"/>
+        </w:rPr>
         <w:t xml:space="preserve">typed_question = st.chat_input("Shkruaj pyetjen tënde për UETassist")</w:t>
       </w:r>
     </w:p>
@@ -5130,6 +5830,20 @@
           <w:sz w:val="16"/>
           <w:szCs w:val="16"/>
         </w:rPr>
+        <w:t xml:space="preserve"># Veprimet e shpejta e dinë detyrën; kur shkruhet tekst i lirë, detyra përcaktohet nga modeli</w:t>
+      </w:r>
+    </w:p>
+    <w:p>
+      <w:pPr>
+        <w:pStyle w:val="Kod"/>
+      </w:pPr>
+      <w:r>
+        <w:rPr>
+          <w:rFonts w:ascii="Consolas" w:cs="Consolas" w:eastAsia="Consolas" w:hAnsi="Consolas"/>
+          <w:noProof/>
+          <w:sz w:val="16"/>
+          <w:szCs w:val="16"/>
+        </w:rPr>
         <w:t xml:space="preserve">forced_task = None if typed_question else pending_task</w:t>
       </w:r>
     </w:p>
@@ -5158,6 +5872,20 @@
           <w:sz w:val="16"/>
           <w:szCs w:val="16"/>
         </w:rPr>
+        <w:t xml:space="preserve"># Përpunon pyetjen: e shton te historia, e dërgon te këshilltari dhe shfaq përgjigjen</w:t>
+      </w:r>
+    </w:p>
+    <w:p>
+      <w:pPr>
+        <w:pStyle w:val="Kod"/>
+      </w:pPr>
+      <w:r>
+        <w:rPr>
+          <w:rFonts w:ascii="Consolas" w:cs="Consolas" w:eastAsia="Consolas" w:hAnsi="Consolas"/>
+          <w:noProof/>
+          <w:sz w:val="16"/>
+          <w:szCs w:val="16"/>
+        </w:rPr>
         <w:t xml:space="preserve">if question:</w:t>
       </w:r>
     </w:p>
@@ -5270,6 +5998,20 @@
           <w:sz w:val="16"/>
           <w:szCs w:val="16"/>
         </w:rPr>
+        <w:t xml:space="preserve">                # Pika kryesore: këshilltari zgjedh rrugën (RAG standard, personalizim ose Study Mode)</w:t>
+      </w:r>
+    </w:p>
+    <w:p>
+      <w:pPr>
+        <w:pStyle w:val="Kod"/>
+      </w:pPr>
+      <w:r>
+        <w:rPr>
+          <w:rFonts w:ascii="Consolas" w:cs="Consolas" w:eastAsia="Consolas" w:hAnsi="Consolas"/>
+          <w:noProof/>
+          <w:sz w:val="16"/>
+          <w:szCs w:val="16"/>
+        </w:rPr>
         <w:t xml:space="preserve">                result = advisor.respond(</w:t>
       </w:r>
     </w:p>
@@ -5438,6 +6180,20 @@
           <w:sz w:val="16"/>
           <w:szCs w:val="16"/>
         </w:rPr>
+        <w:t xml:space="preserve">        # Mungon çelësi OPENAI_API_KEY</w:t>
+      </w:r>
+    </w:p>
+    <w:p>
+      <w:pPr>
+        <w:pStyle w:val="Kod"/>
+      </w:pPr>
+      <w:r>
+        <w:rPr>
+          <w:rFonts w:ascii="Consolas" w:cs="Consolas" w:eastAsia="Consolas" w:hAnsi="Consolas"/>
+          <w:noProof/>
+          <w:sz w:val="16"/>
+          <w:szCs w:val="16"/>
+        </w:rPr>
         <w:t xml:space="preserve">        except llm.MissingApiKeyError as error:</w:t>
       </w:r>
     </w:p>
@@ -5578,6 +6334,20 @@
           <w:sz w:val="16"/>
           <w:szCs w:val="16"/>
         </w:rPr>
+        <w:t xml:space="preserve">            # Ruan profilin e përditësuar dhe numëron pyetjet ndjekëse radhazi</w:t>
+      </w:r>
+    </w:p>
+    <w:p>
+      <w:pPr>
+        <w:pStyle w:val="Kod"/>
+      </w:pPr>
+      <w:r>
+        <w:rPr>
+          <w:rFonts w:ascii="Consolas" w:cs="Consolas" w:eastAsia="Consolas" w:hAnsi="Consolas"/>
+          <w:noProof/>
+          <w:sz w:val="16"/>
+          <w:szCs w:val="16"/>
+        </w:rPr>
         <w:t xml:space="preserve">            st.session_state["profile"] = result["profile"]</w:t>
       </w:r>
     </w:p>
@@ -5634,6 +6404,20 @@
           <w:sz w:val="16"/>
           <w:szCs w:val="16"/>
         </w:rPr>
+        <w:t xml:space="preserve">            # Shfaq burimet vetëm kur ka</w:t>
+      </w:r>
+    </w:p>
+    <w:p>
+      <w:pPr>
+        <w:pStyle w:val="Kod"/>
+      </w:pPr>
+      <w:r>
+        <w:rPr>
+          <w:rFonts w:ascii="Consolas" w:cs="Consolas" w:eastAsia="Consolas" w:hAnsi="Consolas"/>
+          <w:noProof/>
+          <w:sz w:val="16"/>
+          <w:szCs w:val="16"/>
+        </w:rPr>
         <w:t xml:space="preserve">            if result["sources"]:</w:t>
       </w:r>
     </w:p>
@@ -5662,6 +6446,20 @@
           <w:sz w:val="16"/>
           <w:szCs w:val="16"/>
         </w:rPr>
+        <w:t xml:space="preserve">            # Ruan përgjigjen e asistentit te historia e bisedës</w:t>
+      </w:r>
+    </w:p>
+    <w:p>
+      <w:pPr>
+        <w:pStyle w:val="Kod"/>
+      </w:pPr>
+      <w:r>
+        <w:rPr>
+          <w:rFonts w:ascii="Consolas" w:cs="Consolas" w:eastAsia="Consolas" w:hAnsi="Consolas"/>
+          <w:noProof/>
+          <w:sz w:val="16"/>
+          <w:szCs w:val="16"/>
+        </w:rPr>
         <w:t xml:space="preserve">            st.session_state["messages"].append(</w:t>
       </w:r>
     </w:p>
@@ -5775,6 +6573,20 @@
           <w:szCs w:val="16"/>
         </w:rPr>
         <w:t xml:space="preserve">            )</w:t>
+      </w:r>
+    </w:p>
+    <w:p>
+      <w:pPr>
+        <w:pStyle w:val="Kod"/>
+      </w:pPr>
+      <w:r>
+        <w:rPr>
+          <w:rFonts w:ascii="Consolas" w:cs="Consolas" w:eastAsia="Consolas" w:hAnsi="Consolas"/>
+          <w:noProof/>
+          <w:sz w:val="16"/>
+          <w:szCs w:val="16"/>
+        </w:rPr>
+        <w:t xml:space="preserve">            # Ruan profilin te llogaria dhe rifreskon shiritin anësor</w:t>
       </w:r>
     </w:p>
     <w:p>

</xml_diff>

<commit_message>
Semestrat: 4 gjithsej, lëndët e vitit të plotë numërohen vetëm te semestri i dytë; përditëso shtojcat dhe kapitullin
Co-Authored-By: Claude Sonnet 5.5 <noreply@anthropic.com>
Claude-Session: https://claude.ai/code/session_01BybxYwKhdCxZ7QT7Mx6uTb
</commit_message>
<xml_diff>
--- a/docs/Shtojca_B_nderfaqja_UETassist.docx
+++ b/docs/Shtojca_B_nderfaqja_UETassist.docx
@@ -2694,21 +2694,7 @@
           <w:sz w:val="16"/>
           <w:szCs w:val="16"/>
         </w:rPr>
-        <w:t xml:space="preserve">                "Programi, viti dhe semestri përdoren për të gjetur lëndët e semestrit nga plani mësimor. "</w:t>
-      </w:r>
-    </w:p>
-    <w:p>
-      <w:pPr>
-        <w:pStyle w:val="Kod"/>
-      </w:pPr>
-      <w:r>
-        <w:rPr>
-          <w:rFonts w:ascii="Consolas" w:cs="Consolas" w:eastAsia="Consolas" w:hAnsi="Consolas"/>
-          <w:noProof/>
-          <w:sz w:val="16"/>
-          <w:szCs w:val="16"/>
-        </w:rPr>
-        <w:t xml:space="preserve">                "Fakulteti, departamenti dhe specializimi nuk gjenden te dokumentet, prandaj i plotëson ti."</w:t>
+        <w:t xml:space="preserve">                "Programi, viti dhe semestri përdoren për të gjetur lëndët e semestrit nga plani mësimor."</w:t>
       </w:r>
     </w:p>
     <w:p>

</xml_diff>